<commit_message>
Consolidate portfolio into 5 programmes for summary and deck
- Combine UIF Phase 1 + Phase 2 into one project
- Combine DTID Channel Alignment + CTT Attribution Data Alignment
- Keep Workfront-CTT POC, Business-Ready Dataset, and CTT Decommission separate
- Roll up requirements register stats across combined BRD sources

Co-authored-by: demodolly <demodolly@users.noreply.github.com>
</commit_message>
<xml_diff>
--- a/Project Summary.docx
+++ b/Project Summary.docx
@@ -41,7 +41,7 @@
         <w:rPr>
           <w:color w:val="1F4E79"/>
         </w:rPr>
-        <w:t>UIF Phase 1</w:t>
+        <w:t>Unified Intelligence Framework (UIF)</w:t>
       </w:r>
     </w:p>
     <w:p>
@@ -61,7 +61,7 @@
         <w:rPr>
           <w:sz w:val="22"/>
         </w:rPr>
-        <w:t>Phase 1 of the Unified Intelligence Framework establishes the strategic and technical foundation to align marketing spend with revenue across Marketo and Eloqua. It enforces consistent UTM formatting standards across all campaign generation tools (Workfront, Stensul, manual UTM Builder), captures and preserves utm_id, utm_medium, and utm_source at every lead touchpoint regardless of marketing automation platform, and deploys dual ingestion to support legacy CCID/DTID identifiers alongside new UTM schemas for continued attribution and operational reporting during the transition to Workfront-based tracking.</w:t>
+        <w:t>The Unified Intelligence Framework is a two-phase programme to align marketing spend with revenue across Marketo and Eloqua. Phase 1 establishes the hybrid foundation: consistent UTM formatting across all campaign generation tools (Workfront, Stensul, manual UTM Builder), capture and preservation of utm_id, utm_medium, and utm_source at every lead touchpoint, and dual ingestion supporting legacy CCID/DTID alongside new UTM schemas. Phase 2 transitions to Workfront IDs as the Universal Key — auto-generating Channel and Content IDs, embedding Content IDs on all AEM pages, writing last-touch Content ID into form submissions, and preparing strategic Workfront data for SFDC when One Cisco CRM permits.</w:t>
       </w:r>
     </w:p>
     <w:p>
@@ -81,7 +81,7 @@
         <w:rPr>
           <w:sz w:val="22"/>
         </w:rPr>
-        <w:t>Deliver a hybrid-ready tagging and ingestion layer so FY27 reporting, lead attribution, and operational dashboards continue to function while the organisation transitions from Drive To ID / CTT identifiers to industry-standard UTM parameters and Workfront IDs — without breaking existing Salesforce, MSP, or Last Touch reporting.</w:t>
+        <w:t>Deliver end-to-end marketing intelligence from hybrid-ready tagging (Phase 1) through Universal Key attribution (Phase 2) — achieving Zero-Latency Deployment Readiness so that approved Workfront activations flow automatically through AEM, MarTech, Tray, and SFDC, replacing Drive To ID / CTT dependency with industry-standard parameters without breaking FY27 reporting, Salesforce lead creation, MSP, or Last Touch reporting.</w:t>
       </w:r>
     </w:p>
     <w:p>
@@ -106,7 +106,7 @@
         <w:rPr>
           <w:sz w:val="22"/>
         </w:rPr>
-        <w:t>Consistent UTM governance across all online and offline campaign generation tools.</w:t>
+        <w:t>Phase 1: Consistent UTM governance and dual ingestion — legacy and modern reporting in parallel, no big-bang cutover.</w:t>
       </w:r>
     </w:p>
     <w:p>
@@ -118,7 +118,7 @@
         <w:rPr>
           <w:sz w:val="22"/>
         </w:rPr>
-        <w:t>Preserved driving UTMs and legacy CCID/DTID at lead creation — accurate channel and initiative attribution today.</w:t>
+        <w:t>Phase 1: Preserved driving UTMs and legacy IDs at lead creation — accurate attribution today.</w:t>
       </w:r>
     </w:p>
     <w:p>
@@ -130,7 +130,7 @@
         <w:rPr>
           <w:sz w:val="22"/>
         </w:rPr>
-        <w:t>Dual ingestion enables parallel legacy and modern reporting — no big-bang cutover risk.</w:t>
+        <w:t>Phase 1: Standardized Snowflake publishing — one schema for reporting teams.</w:t>
       </w:r>
     </w:p>
     <w:p>
@@ -142,7 +142,7 @@
         <w:rPr>
           <w:sz w:val="22"/>
         </w:rPr>
-        <w:t>Standardized Snowflake publishing format — reporting teams can consume one schema.</w:t>
+        <w:t>Phase 2: Workfront auto-generates Channel and Content IDs — eliminates manual ID creation.</w:t>
       </w:r>
     </w:p>
     <w:p>
@@ -154,7 +154,7 @@
         <w:rPr>
           <w:sz w:val="22"/>
         </w:rPr>
-        <w:t>Foundation for Phase 2 Universal Key (Workfront Content ID) without re-engineering Phase 1 work.</w:t>
+        <w:t>Phase 2: Content ID on every AEM page and form submission — full journey and content attribution.</w:t>
       </w:r>
     </w:p>
     <w:p>
@@ -166,7 +166,31 @@
         <w:rPr>
           <w:sz w:val="22"/>
         </w:rPr>
-        <w:t>Reduced lead rejection risk through improved attribution data quality at source.</w:t>
+        <w:t>Phase 2: Identical Universal Key fields across Marketo and Eloqua — consistent MAP ingestion.</w:t>
+      </w:r>
+    </w:p>
+    <w:p>
+      <w:pPr>
+        <w:pStyle w:val="ListBullet"/>
+        <w:spacing w:after="80"/>
+      </w:pPr>
+      <w:r>
+        <w:rPr>
+          <w:sz w:val="22"/>
+        </w:rPr>
+        <w:t>Combined: Direct path to Adobe North Star — marketing intelligence captured at source.</w:t>
+      </w:r>
+    </w:p>
+    <w:p>
+      <w:pPr>
+        <w:pStyle w:val="ListBullet"/>
+        <w:spacing w:after="80"/>
+      </w:pPr>
+      <w:r>
+        <w:rPr>
+          <w:sz w:val="22"/>
+        </w:rPr>
+        <w:t>Combined: Reduced lead rejection through improved attribution data quality.</w:t>
       </w:r>
     </w:p>
     <w:p/>
@@ -193,7 +217,7 @@
           <w:b/>
           <w:sz w:val="22"/>
         </w:rPr>
-        <w:t>Barrier: Continued mandatory use of CCID &amp; DTID for SFDC lead creation, MSP, and Last Touch reporting.</w:t>
+        <w:t>Barrier: CCID &amp; DTID still mandatory for SFDC lead creation, MSP, and Last Touch reporting.</w:t>
       </w:r>
     </w:p>
     <w:p>
@@ -205,7 +229,7 @@
         <w:rPr>
           <w:sz w:val="22"/>
         </w:rPr>
-        <w:t>Business impact: Cannot fully transition to UTM/Channel ID — teams must maintain strict manual governance across Workfront, URL Builder, Adobe, and Ace Reporting; dual maintenance cost persists.</w:t>
+        <w:t>Business impact: Cannot fully transition to UTM/Channel ID — strict manual governance persists across Workfront, URL Builder, Adobe, and Ace Reporting.</w:t>
       </w:r>
     </w:p>
     <w:p>
@@ -230,7 +254,7 @@
         <w:rPr>
           <w:sz w:val="22"/>
         </w:rPr>
-        <w:t>Business impact: Phase 1 benefits only partially realised; non-Workfront teams still depend on CTT IDs and legacy processes, slowing unified attribution.</w:t>
+        <w:t>Business impact: UIF benefits only partially realised; non-Workfront teams still depend on CTT IDs and legacy processes.</w:t>
       </w:r>
     </w:p>
     <w:p>
@@ -243,7 +267,7 @@
           <w:b/>
           <w:sz w:val="22"/>
         </w:rPr>
-        <w:t>Barrier: Adobe North Star transition gated by Reporting Team FY27 refresh schedule.</w:t>
+        <w:t>Barrier: One Cisco CRM freeze — no SFDC changes in FY27 H1; Phase 2 SFDC push bypassed.</w:t>
       </w:r>
     </w:p>
     <w:p>
@@ -255,7 +279,7 @@
         <w:rPr>
           <w:sz w:val="22"/>
         </w:rPr>
-        <w:t>Business impact: Future-state visibility delayed — interim Phase 1 work may require adjustment when North Star field model is finalised.</w:t>
+        <w:t>Business impact: Seller-facing strategic data not visible in SFDC — Phase 2 value limited to backend/logs until OCC permits changes.</w:t>
       </w:r>
     </w:p>
     <w:p>
@@ -268,7 +292,7 @@
           <w:b/>
           <w:sz w:val="22"/>
         </w:rPr>
-        <w:t>Barrier: Marketo vs Eloqua architecture uncertainty; potential Tealium to Adobe Capture shift (TEA002/TEA003 in review).</w:t>
+        <w:t>Barrier: Adobe North Star and Reporting Team FY27 refresh schedule gate future-state visibility.</w:t>
       </w:r>
     </w:p>
     <w:p>
@@ -280,7 +304,7 @@
         <w:rPr>
           <w:sz w:val="22"/>
         </w:rPr>
-        <w:t>Business impact: Re-work risk on URL and session capture logic; investment in Marketo path may be wasted if architecture pivots again.</w:t>
+        <w:t>Business impact: Interim UIF work may require adjustment when North Star field model is finalised — rework risk.</w:t>
       </w:r>
     </w:p>
     <w:p>
@@ -293,7 +317,7 @@
           <w:b/>
           <w:sz w:val="22"/>
         </w:rPr>
-        <w:t>Barrier: GTMPR UTM strategy for extended fields not yet defined (UTM002 deferred).</w:t>
+        <w:t>Barrier: Marketo/Eloqua architecture uncertainty; Tealium vs Adobe Capture direction (TEA002/TEA003 in review).</w:t>
       </w:r>
     </w:p>
     <w:p>
@@ -305,7 +329,7 @@
         <w:rPr>
           <w:sz w:val="22"/>
         </w:rPr>
-        <w:t>Business impact: Workfront cannot capture extended UTM fields — incomplete strategic data at source for future attribution models.</w:t>
+        <w:t>Business impact: Re-work risk on URL and session capture; investment in one MAP path may be wasted if architecture pivots.</w:t>
       </w:r>
     </w:p>
     <w:p>
@@ -318,7 +342,7 @@
           <w:b/>
           <w:sz w:val="22"/>
         </w:rPr>
-        <w:t>Barrier: AEM Content ID publishing process not yet operational (PUB002 in progress; Stephen Watts delivery Sep 4).</w:t>
+        <w:t>Barrier: Phase 1 incomplete — PUB002 AEM Content ID in progress; UTM002 deferred; 39 Phase 1 reqs Not Started.</w:t>
       </w:r>
     </w:p>
     <w:p>
@@ -330,7 +354,32 @@
         <w:rPr>
           <w:sz w:val="22"/>
         </w:rPr>
-        <w:t>Business impact: Granular content attribution on AEM pages delayed — cannot link customer journey touchpoints to Workfront content assets.</w:t>
+        <w:t>Business impact: All 12 Phase 2 requirements blocked — programme timeline slips with every Phase 1 delay.</w:t>
+      </w:r>
+    </w:p>
+    <w:p>
+      <w:pPr>
+        <w:pStyle w:val="ListBullet"/>
+        <w:spacing w:after="40"/>
+      </w:pPr>
+      <w:r>
+        <w:rPr>
+          <w:b/>
+          <w:sz w:val="22"/>
+        </w:rPr>
+        <w:t>Barrier: GTMPR UTM strategy for extended fields not yet defined.</w:t>
+      </w:r>
+    </w:p>
+    <w:p>
+      <w:pPr>
+        <w:pStyle w:val="ListBullet2"/>
+        <w:spacing w:after="160"/>
+      </w:pPr>
+      <w:r>
+        <w:rPr>
+          <w:sz w:val="22"/>
+        </w:rPr>
+        <w:t>Business impact: Workfront cannot capture full strategic data at source — incomplete input for Phase 2 attribution models.</w:t>
       </w:r>
     </w:p>
     <w:p>
@@ -346,7 +395,7 @@
         <w:rPr>
           <w:color w:val="1F4E79"/>
         </w:rPr>
-        <w:t>UIF Phase 2</w:t>
+        <w:t>DTID &amp; CTT Attribution Data Alignment</w:t>
       </w:r>
     </w:p>
     <w:p>
@@ -366,7 +415,7 @@
         <w:rPr>
           <w:sz w:val="22"/>
         </w:rPr>
-        <w:t>Phase 2 transitions the organisation to Workfront IDs as the Universal Key — linking conversations and conversions to strategic marketing data elements for both the initiative (Channel ID) and the content asset (Content ID). It captures Content IDs on all AEM pages to monitor every content touchpoint in the customer journey, writes last-touch Content ID into form submissions in Marketo/Eloqua, and prepares to append strategic Workfront data elements into SFDC for seller visibility and lead enrichment.</w:t>
+        <w:t>This combined programme delivers FY27 reporting alignment across legacy and modern identifier systems in two parts. First, DTID Channel Alignment adds a Reporting Channel field mapping legacy Vehicle captures to FY27 Reporting Channels while preserving old values until DOPT rewrites attribution models (12 requirements — Complete). Second, Workfront to CTT Attribution Data Alignment adds the same strategic FY27 data elements to CTT Activity IDs, Offer IDs, and the CTT Request Portal — enabling Workfront-first lookup with CTT fallback when Tray/SFDC resources were unavailable due to One Cisco CRM.</w:t>
       </w:r>
     </w:p>
     <w:p>
@@ -386,7 +435,7 @@
         <w:rPr>
           <w:sz w:val="22"/>
         </w:rPr>
-        <w:t>Achieve 'Zero-Latency Deployment Readiness' — the ability to demonstrate that the moment a Workfront activation is approved, its Channel ID and Content ID flow automatically through AEM, MarTech, Tray, and (when permitted) SFDC, enabling true content and initiative attribution without manual ID administration or legacy CTT dependency.</w:t>
+        <w:t>Give Reporting Teams clean FY27 channel definitions and identical strategic data attributes whether activity originates in Workfront or CTT — using simpler future-proofed logic (look for Workfront ID first, fall back to CTT with matching fields) without SFDC or Tray changes that would disrupt One Cisco CRM, and with data ready for when DOPT rewrites models.</w:t>
       </w:r>
     </w:p>
     <w:p>
@@ -411,7 +460,7 @@
         <w:rPr>
           <w:sz w:val="22"/>
         </w:rPr>
-        <w:t>Workfront auto-generates Channel and Content IDs — eliminates manual ID creation for marketing teams.</w:t>
+        <w:t>DTID Reporting Channel delivered — 12/12 Complete; legacy vehicles mapped to FY27 channels.</w:t>
       </w:r>
     </w:p>
     <w:p>
@@ -423,7 +472,7 @@
         <w:rPr>
           <w:sz w:val="22"/>
         </w:rPr>
-        <w:t>Hard-linked UTM_ID on every digital URL — conversions tied directly to approved initiatives.</w:t>
+        <w:t>Workfront-first / CTT-fallback reporting logic — no complex non-1:1 mapping in every report.</w:t>
       </w:r>
     </w:p>
     <w:p>
@@ -435,7 +484,7 @@
         <w:rPr>
           <w:sz w:val="22"/>
         </w:rPr>
-        <w:t>Content ID embedded on every AEM page — full journey attribution to specific content assets.</w:t>
+        <w:t>FY27 reporting parity between Workfront and non-Workfront teams during hybrid operating model.</w:t>
       </w:r>
     </w:p>
     <w:p>
@@ -447,7 +496,7 @@
         <w:rPr>
           <w:sz w:val="22"/>
         </w:rPr>
-        <w:t>Identical Universal Key fields across Marketo and Eloqua — consistent ingestion regardless of MAP.</w:t>
+        <w:t>Historical DTIDs migrated — continuity for FY27 models and YoY analysis.</w:t>
       </w:r>
     </w:p>
     <w:p>
@@ -459,7 +508,7 @@
         <w:rPr>
           <w:sz w:val="22"/>
         </w:rPr>
-        <w:t>Tray dual-source logic correctly enriches leads from Workfront or legacy IDs.</w:t>
+        <w:t>CTT bridge keeps Activity/Offer IDs viable for SFDC lead creation while Workfront adoption grows.</w:t>
       </w:r>
     </w:p>
     <w:p>
@@ -471,7 +520,7 @@
         <w:rPr>
           <w:sz w:val="22"/>
         </w:rPr>
-        <w:t>Hybrid Reporting Mapping document enables YoY analysis without manual translation.</w:t>
+        <w:t>Visibility into who still uses CTT IDs — accelerates migration planning.</w:t>
       </w:r>
     </w:p>
     <w:p>
@@ -483,7 +532,19 @@
         <w:rPr>
           <w:sz w:val="22"/>
         </w:rPr>
-        <w:t>Direct path to Adobe North Star architecture — marketing intelligence captured at source.</w:t>
+        <w:t>OMS and Snowflake receive FY27 attributes for attribution model consumption.</w:t>
+      </w:r>
+    </w:p>
+    <w:p>
+      <w:pPr>
+        <w:pStyle w:val="ListBullet"/>
+        <w:spacing w:after="80"/>
+      </w:pPr>
+      <w:r>
+        <w:rPr>
+          <w:sz w:val="22"/>
+        </w:rPr>
+        <w:t>Data available now for when DOPT and Reporting Teams are ready to rewrite models.</w:t>
       </w:r>
     </w:p>
     <w:p/>
@@ -510,7 +571,7 @@
           <w:b/>
           <w:sz w:val="22"/>
         </w:rPr>
-        <w:t>Barrier: One Cisco CRM (OCC) resource constraints — SFDC push intentionally bypassed; no CRM changes permitted in FY27 H1.</w:t>
+        <w:t>Barrier: One Cisco CRM freeze — no SFDC or Tray API changes for new CTT bridge fields.</w:t>
       </w:r>
     </w:p>
     <w:p>
@@ -522,529 +583,7 @@
         <w:rPr>
           <w:sz w:val="22"/>
         </w:rPr>
-        <w:t>Business impact: Seller-facing strategic data not visible in SFDC — Phase 2 value limited to backend/logs; sales trust in enriched leads cannot be validated.</w:t>
-      </w:r>
-    </w:p>
-    <w:p>
-      <w:pPr>
-        <w:pStyle w:val="ListBullet"/>
-        <w:spacing w:after="40"/>
-      </w:pPr>
-      <w:r>
-        <w:rPr>
-          <w:b/>
-          <w:sz w:val="22"/>
-        </w:rPr>
-        <w:t>Barrier: Reporting teams cannot amend models yet — North Star visibility deferred.</w:t>
-      </w:r>
-    </w:p>
-    <w:p>
-      <w:pPr>
-        <w:pStyle w:val="ListBullet2"/>
-        <w:spacing w:after="160"/>
-      </w:pPr>
-      <w:r>
-        <w:rPr>
-          <w:sz w:val="22"/>
-        </w:rPr>
-        <w:t>Business impact: Cannot prove Phase 2 attribution improvements in production dashboards — business case for full rollout remains unproven.</w:t>
-      </w:r>
-    </w:p>
-    <w:p>
-      <w:pPr>
-        <w:pStyle w:val="ListBullet"/>
-        <w:spacing w:after="40"/>
-      </w:pPr>
-      <w:r>
-        <w:rPr>
-          <w:b/>
-          <w:sz w:val="22"/>
-        </w:rPr>
-        <w:t>Barrier: Phase 2 depends on Phase 1 completion (PUB002 AEM Content ID, TEA review items).</w:t>
-      </w:r>
-    </w:p>
-    <w:p>
-      <w:pPr>
-        <w:pStyle w:val="ListBullet2"/>
-        <w:spacing w:after="160"/>
-      </w:pPr>
-      <w:r>
-        <w:rPr>
-          <w:sz w:val="22"/>
-        </w:rPr>
-        <w:t>Business impact: All 12 Phase 2 requirements blocked at Not Started — programme timeline slips with every Phase 1 delay.</w:t>
-      </w:r>
-    </w:p>
-    <w:p>
-      <w:pPr>
-        <w:pStyle w:val="ListBullet"/>
-        <w:spacing w:after="40"/>
-      </w:pPr>
-      <w:r>
-        <w:rPr>
-          <w:b/>
-          <w:sz w:val="22"/>
-        </w:rPr>
-        <w:t>Barrier: No synchronized staging environment for dual-ingestion end-to-end validation (DSD003).</w:t>
-      </w:r>
-    </w:p>
-    <w:p>
-      <w:pPr>
-        <w:pStyle w:val="ListBullet2"/>
-        <w:spacing w:after="160"/>
-      </w:pPr>
-      <w:r>
-        <w:rPr>
-          <w:sz w:val="22"/>
-        </w:rPr>
-        <w:t>Business impact: Cannot safely test Workfront + legacy ID coexistence — risk of production data corruption if Phase 2 launches prematurely.</w:t>
-      </w:r>
-    </w:p>
-    <w:p>
-      <w:pPr>
-        <w:pStyle w:val="ListBullet"/>
-        <w:spacing w:after="40"/>
-      </w:pPr>
-      <w:r>
-        <w:rPr>
-          <w:b/>
-          <w:sz w:val="22"/>
-        </w:rPr>
-        <w:t>Barrier: Competing priority on CTT FY27 bridge and Phase 1 delivery consumes shared integration capacity.</w:t>
-      </w:r>
-    </w:p>
-    <w:p>
-      <w:pPr>
-        <w:pStyle w:val="ListBullet2"/>
-        <w:spacing w:after="160"/>
-      </w:pPr>
-      <w:r>
-        <w:rPr>
-          <w:sz w:val="22"/>
-        </w:rPr>
-        <w:t>Business impact: Phase 2 receives no dedicated build resource — remains aspirational while bridge work continues.</w:t>
-      </w:r>
-    </w:p>
-    <w:p>
-      <w:r>
-        <w:br w:type="page"/>
-      </w:r>
-    </w:p>
-    <w:p>
-      <w:pPr>
-        <w:pStyle w:val="Heading1"/>
-      </w:pPr>
-      <w:r>
-        <w:rPr>
-          <w:color w:val="1F4E79"/>
-        </w:rPr>
-        <w:t>DTID Channel Alignment</w:t>
-      </w:r>
-    </w:p>
-    <w:p>
-      <w:pPr>
-        <w:spacing w:after="240"/>
-      </w:pPr>
-      <w:r>
-        <w:rPr>
-          <w:b/>
-          <w:color w:val="1F4E79"/>
-          <w:sz w:val="22"/>
-        </w:rPr>
-        <w:t>Project Description</w:t>
-        <w:br/>
-      </w:r>
-      <w:r>
-        <w:rPr>
-          <w:sz w:val="22"/>
-        </w:rPr>
-        <w:t>Because the organisation could not immediately pass UTM values with standardised FY27 channels, platforms, and vendors, this project created a practical translation layer: a dedicated Reporting Channel field on DTIDs that maps legacy Vehicle captures to new FY27 Reporting Channels while preserving old vehicle values until DOPT and Reporting Teams are ready to rewrite attribution models. It updates the CTT DTID creation, edit, and search interfaces plus a one-time historical migration.</w:t>
-      </w:r>
-    </w:p>
-    <w:p>
-      <w:pPr>
-        <w:spacing w:after="240"/>
-      </w:pPr>
-      <w:r>
-        <w:rPr>
-          <w:b/>
-          <w:color w:val="1F4E79"/>
-          <w:sz w:val="22"/>
-        </w:rPr>
-        <w:t>Project Goal</w:t>
-        <w:br/>
-      </w:r>
-      <w:r>
-        <w:rPr>
-          <w:sz w:val="22"/>
-        </w:rPr>
-        <w:t>Align DTID records with FY27 Channel reporting for attribution models and Adobe data capture — giving Reporting Teams clean FY27 channel definitions today without forcing an immediate retirement of legacy DTID values or complex per-report translation logic.</w:t>
-      </w:r>
-    </w:p>
-    <w:p>
-      <w:pPr>
-        <w:spacing w:after="80"/>
-      </w:pPr>
-      <w:r>
-        <w:rPr>
-          <w:b/>
-          <w:color w:val="1F4E79"/>
-          <w:sz w:val="22"/>
-        </w:rPr>
-        <w:t>The Benefits to the Business with Successful Delivery</w:t>
-      </w:r>
-    </w:p>
-    <w:p>
-      <w:pPr>
-        <w:pStyle w:val="ListBullet"/>
-        <w:spacing w:after="80"/>
-      </w:pPr>
-      <w:r>
-        <w:rPr>
-          <w:sz w:val="22"/>
-        </w:rPr>
-        <w:t>Reporting teams can use FY27 channel definitions while DTIDs remain live — no complex translation in every report.</w:t>
-      </w:r>
-    </w:p>
-    <w:p>
-      <w:pPr>
-        <w:pStyle w:val="ListBullet"/>
-        <w:spacing w:after="80"/>
-      </w:pPr>
-      <w:r>
-        <w:rPr>
-          <w:sz w:val="22"/>
-        </w:rPr>
-        <w:t>Workfront-first lookup with CTT fallback logic becomes feasible for hybrid activity.</w:t>
-      </w:r>
-    </w:p>
-    <w:p>
-      <w:pPr>
-        <w:pStyle w:val="ListBullet"/>
-        <w:spacing w:after="80"/>
-      </w:pPr>
-      <w:r>
-        <w:rPr>
-          <w:sz w:val="22"/>
-        </w:rPr>
-        <w:t>Clean channel selection for new DTIDs — deprecated channels hidden from UI.</w:t>
-      </w:r>
-    </w:p>
-    <w:p>
-      <w:pPr>
-        <w:pStyle w:val="ListBullet"/>
-        <w:spacing w:after="80"/>
-      </w:pPr>
-      <w:r>
-        <w:rPr>
-          <w:sz w:val="22"/>
-        </w:rPr>
-        <w:t>Historical DTIDs migrated with audit trail — continuity for FY27 models and YoY analysis.</w:t>
-      </w:r>
-    </w:p>
-    <w:p>
-      <w:pPr>
-        <w:pStyle w:val="ListBullet"/>
-        <w:spacing w:after="80"/>
-      </w:pPr>
-      <w:r>
-        <w:rPr>
-          <w:sz w:val="22"/>
-        </w:rPr>
-        <w:t>Data available and ready for when DOPT rewrites attribution models.</w:t>
-      </w:r>
-    </w:p>
-    <w:p>
-      <w:pPr>
-        <w:pStyle w:val="ListBullet"/>
-        <w:spacing w:after="80"/>
-      </w:pPr>
-      <w:r>
-        <w:rPr>
-          <w:sz w:val="22"/>
-        </w:rPr>
-        <w:t>All 12 requirements delivered (Complete) — proven delivery capability under programme constraints.</w:t>
-      </w:r>
-    </w:p>
-    <w:p/>
-    <w:p>
-      <w:pPr>
-        <w:spacing w:after="160"/>
-      </w:pPr>
-      <w:r>
-        <w:rPr>
-          <w:b/>
-          <w:color w:val="1F4E79"/>
-          <w:sz w:val="22"/>
-        </w:rPr>
-        <w:t>The Barriers and the Impacts to the Business due to those Barriers</w:t>
-      </w:r>
-    </w:p>
-    <w:p>
-      <w:pPr>
-        <w:pStyle w:val="ListBullet"/>
-        <w:spacing w:after="40"/>
-      </w:pPr>
-      <w:r>
-        <w:rPr>
-          <w:b/>
-          <w:sz w:val="22"/>
-        </w:rPr>
-        <w:t>Barrier: Full DTID audit dependency (audit as of 09 Jun 2026) required before historical migration is final.</w:t>
-      </w:r>
-    </w:p>
-    <w:p>
-      <w:pPr>
-        <w:pStyle w:val="ListBullet2"/>
-        <w:spacing w:after="160"/>
-      </w:pPr>
-      <w:r>
-        <w:rPr>
-          <w:sz w:val="22"/>
-        </w:rPr>
-        <w:t>Business impact: Migration completeness depends on audit quality — gaps could leave historical records misaligned with FY27 channels.</w:t>
-      </w:r>
-    </w:p>
-    <w:p>
-      <w:pPr>
-        <w:pStyle w:val="ListBullet"/>
-        <w:spacing w:after="40"/>
-      </w:pPr>
-      <w:r>
-        <w:rPr>
-          <w:b/>
-          <w:sz w:val="22"/>
-        </w:rPr>
-        <w:t>Barrier: Downstream consumers (CTT FY27 bridge, reporting refresh) must adopt Reporting Channel field.</w:t>
-      </w:r>
-    </w:p>
-    <w:p>
-      <w:pPr>
-        <w:pStyle w:val="ListBullet2"/>
-        <w:spacing w:after="160"/>
-      </w:pPr>
-      <w:r>
-        <w:rPr>
-          <w:sz w:val="22"/>
-        </w:rPr>
-        <w:t>Business impact: Value of DTID alignment is not realised until reporting models and CTT bridge reference the new field.</w:t>
-      </w:r>
-    </w:p>
-    <w:p>
-      <w:pPr>
-        <w:pStyle w:val="ListBullet"/>
-        <w:spacing w:after="40"/>
-      </w:pPr>
-      <w:r>
-        <w:rPr>
-          <w:b/>
-          <w:sz w:val="22"/>
-        </w:rPr>
-        <w:t>Barrier: Legacy DTIDs and vehicles still active in SFDC during transitional phase.</w:t>
-      </w:r>
-    </w:p>
-    <w:p>
-      <w:pPr>
-        <w:pStyle w:val="ListBullet2"/>
-        <w:spacing w:after="160"/>
-      </w:pPr>
-      <w:r>
-        <w:rPr>
-          <w:sz w:val="22"/>
-        </w:rPr>
-        <w:t>Business impact: Dual identifier world persists — teams must understand both legacy vehicle and new reporting channel semantics.</w:t>
-      </w:r>
-    </w:p>
-    <w:p>
-      <w:r>
-        <w:br w:type="page"/>
-      </w:r>
-    </w:p>
-    <w:p>
-      <w:pPr>
-        <w:pStyle w:val="Heading1"/>
-      </w:pPr>
-      <w:r>
-        <w:rPr>
-          <w:color w:val="1F4E79"/>
-        </w:rPr>
-        <w:t>Workfront to CTT Attribution Data Alignment</w:t>
-      </w:r>
-    </w:p>
-    <w:p>
-      <w:pPr>
-        <w:spacing w:after="240"/>
-      </w:pPr>
-      <w:r>
-        <w:rPr>
-          <w:b/>
-          <w:color w:val="1F4E79"/>
-          <w:sz w:val="22"/>
-        </w:rPr>
-        <w:t>Project Description</w:t>
-        <w:br/>
-      </w:r>
-      <w:r>
-        <w:rPr>
-          <w:sz w:val="22"/>
-        </w:rPr>
-        <w:t>Unable to secure Tray or SFDC resources in the first half of FY27 due to the One Cisco CRM programme, the team pivoted to a bridge approach: add the same strategic FY27 data elements to CTT Activity IDs and Offer IDs that Workfront captures, so reporting can use simpler future-proofed logic — first look for a Workfront ID and use corresponding data elements; if not found, use CTT data with matching attributes. This also supports CTT decommission planning by monitoring who still uses CTT IDs and migrating them to Workfront. The CTT Request Portal is updated to match.</w:t>
-      </w:r>
-    </w:p>
-    <w:p>
-      <w:pPr>
-        <w:spacing w:after="240"/>
-      </w:pPr>
-      <w:r>
-        <w:rPr>
-          <w:b/>
-          <w:color w:val="1F4E79"/>
-          <w:sz w:val="22"/>
-        </w:rPr>
-        <w:t>Project Goal</w:t>
-        <w:br/>
-      </w:r>
-      <w:r>
-        <w:rPr>
-          <w:sz w:val="22"/>
-        </w:rPr>
-        <w:t>Support FY27 attribution models for channel activations and content consumption during the hybrid period — ensuring Workfront and non-Workfront teams report on the same FY27 data elements through CTT/portal bridge fields, without SFDC or Tray changes that would disrupt One Cisco CRM.</w:t>
-      </w:r>
-    </w:p>
-    <w:p>
-      <w:pPr>
-        <w:spacing w:after="80"/>
-      </w:pPr>
-      <w:r>
-        <w:rPr>
-          <w:b/>
-          <w:color w:val="1F4E79"/>
-          <w:sz w:val="22"/>
-        </w:rPr>
-        <w:t>The Benefits to the Business with Successful Delivery</w:t>
-      </w:r>
-    </w:p>
-    <w:p>
-      <w:pPr>
-        <w:pStyle w:val="ListBullet"/>
-        <w:spacing w:after="80"/>
-      </w:pPr>
-      <w:r>
-        <w:rPr>
-          <w:sz w:val="22"/>
-        </w:rPr>
-        <w:t>FY27 reporting parity between Workfront and non-Workfront teams during hybrid operating model.</w:t>
-      </w:r>
-    </w:p>
-    <w:p>
-      <w:pPr>
-        <w:pStyle w:val="ListBullet"/>
-        <w:spacing w:after="80"/>
-      </w:pPr>
-      <w:r>
-        <w:rPr>
-          <w:sz w:val="22"/>
-        </w:rPr>
-        <w:t>Simpler reporting logic — Workfront-first lookup, CTT fallback with identical attributes.</w:t>
-      </w:r>
-    </w:p>
-    <w:p>
-      <w:pPr>
-        <w:pStyle w:val="ListBullet"/>
-        <w:spacing w:after="80"/>
-      </w:pPr>
-      <w:r>
-        <w:rPr>
-          <w:sz w:val="22"/>
-        </w:rPr>
-        <w:t>Reduced complex 1:1 mapping logic that does not match cleanly across legacy and modern identifiers.</w:t>
-      </w:r>
-    </w:p>
-    <w:p>
-      <w:pPr>
-        <w:pStyle w:val="ListBullet"/>
-        <w:spacing w:after="80"/>
-      </w:pPr>
-      <w:r>
-        <w:rPr>
-          <w:sz w:val="22"/>
-        </w:rPr>
-        <w:t>CTT/Activity ID remains viable for SFDC lead creation while Workfront adoption grows.</w:t>
-      </w:r>
-    </w:p>
-    <w:p>
-      <w:pPr>
-        <w:pStyle w:val="ListBullet"/>
-        <w:spacing w:after="80"/>
-      </w:pPr>
-      <w:r>
-        <w:rPr>
-          <w:sz w:val="22"/>
-        </w:rPr>
-        <w:t>Visibility into who still uses CTT IDs — accelerates migration to Workfront.</w:t>
-      </w:r>
-    </w:p>
-    <w:p>
-      <w:pPr>
-        <w:pStyle w:val="ListBullet"/>
-        <w:spacing w:after="80"/>
-      </w:pPr>
-      <w:r>
-        <w:rPr>
-          <w:sz w:val="22"/>
-        </w:rPr>
-        <w:t>Portal requestors get FY27 hierarchy, funnel, and stakeholder fields at intake.</w:t>
-      </w:r>
-    </w:p>
-    <w:p>
-      <w:pPr>
-        <w:pStyle w:val="ListBullet"/>
-        <w:spacing w:after="80"/>
-      </w:pPr>
-      <w:r>
-        <w:rPr>
-          <w:sz w:val="22"/>
-        </w:rPr>
-        <w:t>OMS and Snowflake receive FY27 attributes for attribution model consumption.</w:t>
-      </w:r>
-    </w:p>
-    <w:p/>
-    <w:p>
-      <w:pPr>
-        <w:spacing w:after="160"/>
-      </w:pPr>
-      <w:r>
-        <w:rPr>
-          <w:b/>
-          <w:color w:val="1F4E79"/>
-          <w:sz w:val="22"/>
-        </w:rPr>
-        <w:t>The Barriers and the Impacts to the Business due to those Barriers</w:t>
-      </w:r>
-    </w:p>
-    <w:p>
-      <w:pPr>
-        <w:pStyle w:val="ListBullet"/>
-        <w:spacing w:after="40"/>
-      </w:pPr>
-      <w:r>
-        <w:rPr>
-          <w:b/>
-          <w:sz w:val="22"/>
-        </w:rPr>
-        <w:t>Barrier: One Cisco CRM freeze — no SFDC or Tray API changes for new CTT fields (CTT016).</w:t>
-      </w:r>
-    </w:p>
-    <w:p>
-      <w:pPr>
-        <w:pStyle w:val="ListBullet2"/>
-        <w:spacing w:after="160"/>
-      </w:pPr>
-      <w:r>
-        <w:rPr>
-          <w:sz w:val="22"/>
-        </w:rPr>
-        <w:t>Business impact: Bridge data cannot flow to CRM in FY27 H1 — reporting must consume from OMS/Snowflake side only; seller enrichment delayed.</w:t>
+        <w:t>Business impact: Bridge data cannot flow to CRM in FY27 H1 — reporting must consume from OMS/Snowflake only; seller enrichment delayed.</w:t>
       </w:r>
     </w:p>
     <w:p>
@@ -1069,7 +608,7 @@
         <w:rPr>
           <w:sz w:val="22"/>
         </w:rPr>
-        <w:t>Business impact: CTT must remain live and enhanced rather than retired — dual tool investment continues.</w:t>
+        <w:t>Business impact: CTT must remain live and enhanced — dual tool investment continues instead of retirement.</w:t>
       </w:r>
     </w:p>
     <w:p>
@@ -1082,32 +621,7 @@
           <w:b/>
           <w:sz w:val="22"/>
         </w:rPr>
-        <w:t>Barrier: Unclear architectural direction for Workfront data (raw vs business-ready dataset).</w:t>
-      </w:r>
-    </w:p>
-    <w:p>
-      <w:pPr>
-        <w:pStyle w:val="ListBullet2"/>
-        <w:spacing w:after="160"/>
-      </w:pPr>
-      <w:r>
-        <w:rPr>
-          <w:sz w:val="22"/>
-        </w:rPr>
-        <w:t>Business impact: CTT bridge field design may need rework when GTMRP dataset is defined — replanning risk.</w:t>
-      </w:r>
-    </w:p>
-    <w:p>
-      <w:pPr>
-        <w:pStyle w:val="ListBullet"/>
-        <w:spacing w:after="40"/>
-      </w:pPr>
-      <w:r>
-        <w:rPr>
-          <w:b/>
-          <w:sz w:val="22"/>
-        </w:rPr>
-        <w:t>Barrier: Portal requirements (POR001–POR010) not yet started — 10 of 26 items still Not Started.</w:t>
+        <w:t>Barrier: CTT portal requirements (POR001–POR010) not started — 10 of 26 bridge items Not Started.</w:t>
       </w:r>
     </w:p>
     <w:p>
@@ -1144,7 +658,7 @@
         <w:rPr>
           <w:sz w:val="22"/>
         </w:rPr>
-        <w:t>Business impact: Cross-time reporting accuracy compromised until historical records are updated.</w:t>
+        <w:t>Business impact: Cross-time reporting accuracy compromised until historical CTT records are updated.</w:t>
       </w:r>
     </w:p>
     <w:p>
@@ -1157,7 +671,7 @@
           <w:b/>
           <w:sz w:val="22"/>
         </w:rPr>
-        <w:t>Barrier: CTT decommission not planned FY27 — bridge scope expands while decommission BRD assumes retirement.</w:t>
+        <w:t>Barrier: Full DTID audit dependency (as of 09 Jun 2026) required before migration is final.</w:t>
       </w:r>
     </w:p>
     <w:p>
@@ -1169,7 +683,57 @@
         <w:rPr>
           <w:sz w:val="22"/>
         </w:rPr>
-        <w:t>Business impact: Competing investment in extending vs retiring CTT — technical debt and team fatigue grow.</w:t>
+        <w:t>Business impact: Gaps in DTID audit could leave historical records misaligned with FY27 channels.</w:t>
+      </w:r>
+    </w:p>
+    <w:p>
+      <w:pPr>
+        <w:pStyle w:val="ListBullet"/>
+        <w:spacing w:after="40"/>
+      </w:pPr>
+      <w:r>
+        <w:rPr>
+          <w:b/>
+          <w:sz w:val="22"/>
+        </w:rPr>
+        <w:t>Barrier: Unclear raw vs business-ready Workfront data architecture.</w:t>
+      </w:r>
+    </w:p>
+    <w:p>
+      <w:pPr>
+        <w:pStyle w:val="ListBullet2"/>
+        <w:spacing w:after="160"/>
+      </w:pPr>
+      <w:r>
+        <w:rPr>
+          <w:sz w:val="22"/>
+        </w:rPr>
+        <w:t>Business impact: CTT bridge field design may need rework when GTMRP dataset is defined — replanning risk.</w:t>
+      </w:r>
+    </w:p>
+    <w:p>
+      <w:pPr>
+        <w:pStyle w:val="ListBullet"/>
+        <w:spacing w:after="40"/>
+      </w:pPr>
+      <w:r>
+        <w:rPr>
+          <w:b/>
+          <w:sz w:val="22"/>
+        </w:rPr>
+        <w:t>Barrier: CTT decommission not planned FY27 — bridge scope expands while retirement BRD assumes cutover.</w:t>
+      </w:r>
+    </w:p>
+    <w:p>
+      <w:pPr>
+        <w:pStyle w:val="ListBullet2"/>
+        <w:spacing w:after="160"/>
+      </w:pPr>
+      <w:r>
+        <w:rPr>
+          <w:sz w:val="22"/>
+        </w:rPr>
+        <w:t>Business impact: Competing investment in extending vs retiring CTT — technical debt grows.</w:t>
       </w:r>
     </w:p>
     <w:p>
@@ -1614,7 +1178,7 @@
         <w:rPr>
           <w:sz w:val="22"/>
         </w:rPr>
-        <w:t>Foundation for raw vs business-ready architectural decision — enables CTT bridge and Phase 2 alignment.</w:t>
+        <w:t>Resolves raw vs business-ready architectural decision — unblocks CTT bridge and UIF Phase 2 alignment.</w:t>
       </w:r>
     </w:p>
     <w:p/>
@@ -1666,7 +1230,7 @@
           <w:b/>
           <w:sz w:val="22"/>
         </w:rPr>
-        <w:t>Barrier: Workfront field definitions still evolving with UIF Phase 1/2 and CTT bridge.</w:t>
+        <w:t>Barrier: Workfront field definitions still evolving with UIF and CTT bridge programmes.</w:t>
       </w:r>
     </w:p>
     <w:p>
@@ -1741,7 +1305,7 @@
           <w:b/>
           <w:sz w:val="22"/>
         </w:rPr>
-        <w:t>Barrier: CTT bridge project waiting on raw vs business-ready architectural decision.</w:t>
+        <w:t>Barrier: CTT bridge programme waiting on raw vs business-ready architectural decision.</w:t>
       </w:r>
     </w:p>
     <w:p>
@@ -1970,7 +1534,7 @@
         <w:rPr>
           <w:sz w:val="22"/>
         </w:rPr>
-        <w:t>Business impact: Core decommission step (IT003) impossible in FY27 — CTT cannot be retired while CCID is architecturally required.</w:t>
+        <w:t>Business impact: Core decommission step impossible in FY27 — CTT cannot be retired while CCID is architecturally required.</w:t>
       </w:r>
     </w:p>
     <w:p>

</xml_diff>